<commit_message>
Converted tasklist to md
</commit_message>
<xml_diff>
--- a/Algorithms description and comparison.docx
+++ b/Algorithms description and comparison.docx
@@ -2889,26 +2889,6 @@
         </w:tc>
       </w:tr>
     </w:tbl>
-    <w:p>
-      <w:pPr>
-        <w:rPr>
-          <w:b/>
-          <w:sz w:val="32"/>
-          <w:szCs w:val="32"/>
-          <w:lang w:val="en-US"/>
-        </w:rPr>
-      </w:pPr>
-    </w:p>
-    <w:p>
-      <w:pPr>
-        <w:rPr>
-          <w:b/>
-          <w:sz w:val="32"/>
-          <w:szCs w:val="32"/>
-          <w:lang w:val="en-US"/>
-        </w:rPr>
-      </w:pPr>
-    </w:p>
     <w:p>
       <w:pPr>
         <w:rPr>
@@ -3639,6 +3619,7 @@
   <w:style w:type="character" w:default="1" w:styleId="DefaultParagraphFont">
     <w:name w:val="Default Paragraph Font"/>
     <w:uiPriority w:val="1"/>
+    <w:semiHidden/>
     <w:unhideWhenUsed/>
   </w:style>
   <w:style w:type="table" w:default="1" w:styleId="TableNormal">

</xml_diff>